<commit_message>
Quantify resume bullets with user-provided figures
Adds 50+ AD sites, MFA rollout to 300+ users, SAML SSO for 4 enterprise
apps, named GPO scope and SLA-based resolution.

Co-Authored-By: Claude Opus 5.5 <noreply@anthropic.com>
Claude-Session: https://claude.ai/code/session_01VbUC1yQeE2ZKXsQwtu7PFh
</commit_message>
<xml_diff>
--- a/resume/Athi_Shree_V_Resume_Classic.docx
+++ b/resume/Athi_Shree_V_Resume_Classic.docx
@@ -68,7 +68,7 @@
         <w:rPr>
           <w:b w:val="0"/>
         </w:rPr>
-        <w:t>Active Directory and Microsoft Entra ID (Azure AD) Administrator with 3.8 years of experience in enterprise Identity and Access Management (IAM) for global banking and life-sciences clients, supporting 10,000+ users and 50+ Domain Controllers. L2/L3 expertise in AD DS, AD replication, Group Policy (GPO), DNS, DHCP and LDAP, plus hybrid identity with Microsoft Entra Connect, SAML SSO, MFA, Conditional Access and RBAC. SC-300 certified; uses PowerShell, ServiceNow and Splunk to deliver secure, well-controlled incident and change management.</w:t>
+        <w:t>Active Directory and Microsoft Entra ID (Azure AD) Administrator with 3.8 years of experience in enterprise Identity and Access Management (IAM) for global banking and life-sciences clients, supporting 10,000+ users, 50+ Domain Controllers and 50+ AD sites. L2/L3 expertise in AD DS, AD replication, Group Policy (GPO), DNS, DHCP and LDAP, plus hybrid identity with Microsoft Entra Connect, SAML SSO, MFA, Conditional Access and RBAC. SC-300 certified; uses PowerShell, ServiceNow and Splunk to deliver secure, well-controlled incident and change management.</w:t>
       </w:r>
     </w:p>
     <w:p>
@@ -278,7 +278,7 @@
         <w:spacing w:after="60"/>
       </w:pPr>
       <w:r>
-        <w:t>Administer Group Policy (GPO): troubleshoot, validate and optimize policy application and security settings.</w:t>
+        <w:t>Administer Group Policy, including the Default Domain Controllers Policy: troubleshoot, validate and optimize security settings.</w:t>
       </w:r>
     </w:p>
     <w:p>
@@ -287,7 +287,7 @@
         <w:spacing w:after="60"/>
       </w:pPr>
       <w:r>
-        <w:t>Maintain AD Sites and Services, subnets and replication topology for reliable connectivity across locations.</w:t>
+        <w:t>Maintain AD Sites and Services, subnets and replication topology across 50+ AD sites.</w:t>
       </w:r>
     </w:p>
     <w:p>
@@ -314,7 +314,7 @@
         <w:spacing w:after="60"/>
       </w:pPr>
       <w:r>
-        <w:t>Handle incident and change activities for security access requests, from validation to closure.</w:t>
+        <w:t>Handle incident and change activities for security access requests, resolving them within SLA.</w:t>
       </w:r>
     </w:p>
     <w:p>
@@ -364,7 +364,7 @@
         <w:spacing w:after="60"/>
       </w:pPr>
       <w:r>
-        <w:t>Created, maintained and troubleshot Group Policy Objects (GPOs) to enforce security standards.</w:t>
+        <w:t>Created, maintained and troubleshot Windows Group Policy Objects (GPOs) to enforce security standards.</w:t>
       </w:r>
     </w:p>
     <w:p>
@@ -373,7 +373,7 @@
         <w:spacing w:after="60"/>
       </w:pPr>
       <w:r>
-        <w:t>Managed Microsoft Entra ID users and groups; implemented MFA, Conditional Access and group-based licensing.</w:t>
+        <w:t>Rolled out MFA to 300+ users; managed Entra ID users, groups, Conditional Access and group-based licensing.</w:t>
       </w:r>
     </w:p>
     <w:p>
@@ -382,7 +382,7 @@
         <w:spacing w:after="60"/>
       </w:pPr>
       <w:r>
-        <w:t>Configured SAML SSO and Microsoft Entra Connect for hybrid identity; reviewed audit and sign-in logs.</w:t>
+        <w:t>Configured SAML single sign-on for 4 enterprise applications and Entra Connect for hybrid identity.</w:t>
       </w:r>
     </w:p>
     <w:p>

</xml_diff>